<commit_message>
Replace Jowsey et al. (2025) with Nowell et al. (2017) in the analysis insert.
Keep clerical software from being treated as the analytic method and ground quotation checks in the audit trail.

Co-authored-by: delano2x-Procedurals <delano2x-Procedurals@users.noreply.github.com>
</commit_message>
<xml_diff>
--- a/downloads/WALKER_Project_Plan_Data_Analysis_4para.docx
+++ b/downloads/WALKER_Project_Plan_Data_Analysis_4para.docx
@@ -160,7 +160,7 @@
           <w:i w:val="0"/>
           <w:sz w:val="24"/>
         </w:rPr>
-        <w:t>Fourth, the researcher will write two separate syntheses from the reviewed theme records: one for stakeholder-claim management and salience shifts, and one for decision rights, escalation, and recoverability assurance (Lester et al., 2020; Percy et al., 2015). Presentation will include a meaning-unit evidence table, a theme-to-question map, and a narrative that pairs each interpretive claim with source-verified excerpts and relevant boundary cases, including Path B verbal reconstructions and Path C “no reviewable artifact named” rows. Every published quotation, participant label, source locator, and thematic claim will receive a source check; table titles and theme names will be compared with the narrative. Participant counts, excerpt counts, and source counts will remain separate. The researcher will close the revision log, record unresolved gaps, and release a dated version of the report, codebook, and CSV nest (Carcary, 2020). If generative tools are used for clerical support, the log will identify the task, date, inputs, output, and corrections; confidential material will remain within approved arrangements, and human verification will remain required (Jowsey et al., 2025). Findings will distinguish managers’ reported interpretations from independently documented actions and will not claim statistical generalization.</w:t>
+        <w:t>Fourth, the researcher will write two separate syntheses from the reviewed theme records: one for stakeholder-claim management and salience shifts, and one for decision rights, escalation, and recoverability assurance (Lester et al., 2020; Percy et al., 2015). Presentation will include a meaning-unit evidence table, a theme-to-question map, and a narrative that pairs each interpretive claim with source-verified excerpts and relevant boundary cases, including Path B verbal reconstructions and Path C “no reviewable artifact named” rows. Every published quotation, participant label, source locator, and thematic claim will receive a source check; table titles and theme names will be compared with the narrative. Participant counts, excerpt counts, and source counts will remain separate. The researcher will close the revision log, record unresolved gaps, and release a dated version of the report, codebook, and CSV nest (Carcary, 2020). Clerical software and retrieval aids will not replace researcher interpretation; every quotation and thematic claim will remain grounded in the CLEAN transcript and the dated audit trail (Nowell et al., 2017). Findings will distinguish managers’ reported interpretations from independently documented actions and will not claim statistical generalization.</w:t>
       </w:r>
     </w:p>
     <w:p>
@@ -454,37 +454,6 @@
           <w:i w:val="0"/>
           <w:sz w:val="24"/>
         </w:rPr>
-        <w:t xml:space="preserve">Jowsey, T., Stapleton, P., Campbell, S., Davidson, A., McGillivray, C., Maugeri, I., Lee, M., &amp; Keogh, J. (2025). Frankenstein, thematic analysis and generative artificial intelligence: Quality appraisal methods and considerations for qualitative research. </w:t>
-      </w:r>
-      <w:r>
-        <w:rPr>
-          <w:rFonts w:ascii="Times New Roman" w:hAnsi="Times New Roman" w:eastAsia="Times New Roman"/>
-          <w:i/>
-          <w:sz w:val="24"/>
-        </w:rPr>
-        <w:t>PLOS ONE, 20</w:t>
-      </w:r>
-      <w:r>
-        <w:rPr>
-          <w:rFonts w:ascii="Times New Roman" w:hAnsi="Times New Roman" w:eastAsia="Times New Roman"/>
-          <w:b w:val="0"/>
-          <w:i w:val="0"/>
-          <w:sz w:val="24"/>
-        </w:rPr>
-        <w:t>(9), Article e0330217. https://doi.org/10.1371/journal.pone.0330217</w:t>
-      </w:r>
-    </w:p>
-    <w:p>
-      <w:pPr>
-        <w:spacing w:after="120" w:before="0" w:line="480" w:lineRule="auto"/>
-      </w:pPr>
-      <w:r>
-        <w:rPr>
-          <w:rFonts w:ascii="Times New Roman" w:hAnsi="Times New Roman" w:eastAsia="Times New Roman"/>
-          <w:b w:val="0"/>
-          <w:i w:val="0"/>
-          <w:sz w:val="24"/>
-        </w:rPr>
         <w:t xml:space="preserve">Kahlke, R. M. (2014). Generic qualitative approaches: Pitfalls and benefits of methodological mixology. </w:t>
       </w:r>
       <w:r>
@@ -658,6 +627,37 @@
           <w:sz w:val="24"/>
         </w:rPr>
         <w:t>, 1–17. https://doi.org/10.1177/16094069241229777</w:t>
+      </w:r>
+    </w:p>
+    <w:p>
+      <w:pPr>
+        <w:spacing w:after="120" w:before="0" w:line="480" w:lineRule="auto"/>
+      </w:pPr>
+      <w:r>
+        <w:rPr>
+          <w:rFonts w:ascii="Times New Roman" w:hAnsi="Times New Roman" w:eastAsia="Times New Roman"/>
+          <w:b w:val="0"/>
+          <w:i w:val="0"/>
+          <w:sz w:val="24"/>
+        </w:rPr>
+        <w:t xml:space="preserve">Nowell, L. S., Norris, J. M., White, D. E., &amp; Moules, N. J. (2017). Thematic analysis: Striving to meet the trustworthiness criteria. </w:t>
+      </w:r>
+      <w:r>
+        <w:rPr>
+          <w:rFonts w:ascii="Times New Roman" w:hAnsi="Times New Roman" w:eastAsia="Times New Roman"/>
+          <w:i/>
+          <w:sz w:val="24"/>
+        </w:rPr>
+        <w:t>International Journal of Qualitative Methods, 16</w:t>
+      </w:r>
+      <w:r>
+        <w:rPr>
+          <w:rFonts w:ascii="Times New Roman" w:hAnsi="Times New Roman" w:eastAsia="Times New Roman"/>
+          <w:b w:val="0"/>
+          <w:i w:val="0"/>
+          <w:sz w:val="24"/>
+        </w:rPr>
+        <w:t>(1), 1–13. https://doi.org/10.1177/1609406917733847</w:t>
       </w:r>
     </w:p>
     <w:p>

</xml_diff>